<commit_message>
court(utah): brief-on-the-merits gated on latex (the held-token note fix landed), docx reported (LibreOffice note placement); rehearing INPUT joins a paragraph split at the filed copy's page break, still reported (fb-595.54.45)
Co-Authored-By: Claude Opus 5.5 <noreply@anthropic.com>
</commit_message>
<xml_diff>
--- a/courts/tenth-circuit/utah/state/supreme-court/petition-for-rehearing/usage/OUTPUT-petition-for-rehearing.docx
+++ b/courts/tenth-circuit/utah/state/supreme-court/petition-for-rehearing/usage/OUTPUT-petition-for-rehearing.docx
@@ -1158,15 +1158,7 @@
         <w:footnoteReference w:id="12"/>
       </w:r>
       <w:r>
-        <w:t xml:space="preserve">,</w:t>
-      </w:r>
-    </w:p>
-    <w:p>
-      <w:pPr>
-        <w:pStyle w:val="BodyTextNote"/>
-      </w:pPr>
-      <w:r>
-        <w:t xml:space="preserve">and §78B</w:t>
+        <w:t xml:space="preserve">, and §78B</w:t>
       </w:r>
       <w:r>
         <w:noBreakHyphen/>

</xml_diff>